<commit_message>
fix: populate PPTX slides from hidden deck sections
Extract text from visibility:hidden slides in document order, improve PPTX text layout, and regenerate Logo Design pilot exports so cached decks include full slide content.

Co-authored-by: Cursor <cursoragent@cursor.com>
</commit_message>
<xml_diff>
--- a/public/assets/editable/professional-logo-design-overview-1/de/Professional Logo Design Overview - de.docx
+++ b/public/assets/editable/professional-logo-design-overview-1/de/Professional Logo Design Overview - de.docx
@@ -88,7 +88,23 @@
         <w:pStyle w:val="Heading2"/>
       </w:pPr>
       <w:r>
+        <w:t xml:space="preserve">Inhalt</w:t>
+      </w:r>
+    </w:p>
+    <w:p>
+      <w:pPr>
+        <w:pStyle w:val="Heading2"/>
+      </w:pPr>
+      <w:r>
         <w:t xml:space="preserve">Was drin ist.</w:t>
+      </w:r>
+    </w:p>
+    <w:p>
+      <w:pPr>
+        <w:pStyle w:val="Heading2"/>
+      </w:pPr>
+      <w:r>
+        <w:t xml:space="preserve">01 — Auf einen Blick</w:t>
       </w:r>
     </w:p>
     <w:p>
@@ -183,6 +199,14 @@
     </w:p>
     <w:p>
       <w:pPr>
+        <w:pStyle w:val="Heading2"/>
+      </w:pPr>
+      <w:r>
+        <w:t xml:space="preserve">02 — Die Chance</w:t>
+      </w:r>
+    </w:p>
+    <w:p>
+      <w:pPr>
         <w:pStyle w:val="Heading1"/>
       </w:pPr>
       <w:r>
@@ -336,6 +360,14 @@
     </w:p>
     <w:p>
       <w:pPr>
+        <w:pStyle w:val="Heading2"/>
+      </w:pPr>
+      <w:r>
+        <w:t xml:space="preserve">03 — Das Produkt</w:t>
+      </w:r>
+    </w:p>
+    <w:p>
+      <w:pPr>
         <w:pStyle w:val="Heading1"/>
       </w:pPr>
       <w:r>
@@ -352,6 +384,22 @@
           <w:szCs w:val="22"/>
         </w:rPr>
         <w:t xml:space="preserve">Professionelles Logo-Design wird über einen dedizierten Logo-Design-Koordinator geliefert. Kunden erhalten ein individuelles Logo, das um ihr Unternehmen herum gebaut wird.</w:t>
+      </w:r>
+    </w:p>
+    <w:p>
+      <w:pPr>
+        <w:pStyle w:val="Heading3"/>
+      </w:pPr>
+      <w:r>
+        <w:t xml:space="preserve">Für wen es ist</w:t>
+      </w:r>
+    </w:p>
+    <w:p>
+      <w:pPr>
+        <w:pStyle w:val="Heading3"/>
+      </w:pPr>
+      <w:r>
+        <w:t xml:space="preserve">Warum es gewinnt</w:t>
       </w:r>
     </w:p>
     <w:p>
@@ -414,6 +462,14 @@
     </w:p>
     <w:p>
       <w:pPr>
+        <w:pStyle w:val="Heading2"/>
+      </w:pPr>
+      <w:r>
+        <w:t xml:space="preserve">04 — Funktionen &amp; Lieferumfang</w:t>
+      </w:r>
+    </w:p>
+    <w:p>
+      <w:pPr>
         <w:pStyle w:val="Heading1"/>
       </w:pPr>
       <w:r>
@@ -459,6 +515,14 @@
     </w:p>
     <w:p>
       <w:pPr>
+        <w:pStyle w:val="Heading2"/>
+      </w:pPr>
+      <w:r>
+        <w:t xml:space="preserve">05 — Der kreative Prozess</w:t>
+      </w:r>
+    </w:p>
+    <w:p>
+      <w:pPr>
         <w:pStyle w:val="Heading1"/>
       </w:pPr>
       <w:r>
@@ -467,6 +531,18 @@
     </w:p>
     <w:p>
       <w:pPr>
+        <w:spacing w:after="160"/>
+      </w:pPr>
+      <w:r>
+        <w:rPr>
+          <w:sz w:val="22"/>
+          <w:szCs w:val="22"/>
+        </w:rPr>
+        <w:t xml:space="preserve">Fünf klar definierte Schritte. Gesamtzeitplan von zwei bis drei Wochen für die meisten Projekte.</w:t>
+      </w:r>
+    </w:p>
+    <w:p>
+      <w:pPr>
         <w:pStyle w:val="Heading3"/>
       </w:pPr>
       <w:r>
@@ -475,6 +551,18 @@
     </w:p>
     <w:p>
       <w:pPr>
+        <w:spacing w:after="160"/>
+      </w:pPr>
+      <w:r>
+        <w:rPr>
+          <w:sz w:val="22"/>
+          <w:szCs w:val="22"/>
+        </w:rPr>
+        <w:t xml:space="preserve">Der Kunde kauft ein Paket und erhält eine Willkommens-E-Mail.</w:t>
+      </w:r>
+    </w:p>
+    <w:p>
+      <w:pPr>
         <w:pStyle w:val="Heading3"/>
       </w:pPr>
       <w:r>
@@ -483,6 +571,18 @@
     </w:p>
     <w:p>
       <w:pPr>
+        <w:spacing w:after="160"/>
+      </w:pPr>
+      <w:r>
+        <w:rPr>
+          <w:sz w:val="22"/>
+          <w:szCs w:val="22"/>
+        </w:rPr>
+        <w:t xml:space="preserve">Ein dedizierter Koordinator ruft an und mailt, um das Briefing aufzunehmen — Ziele, Stil, Schriften, Farben, Referenzlogos.</w:t>
+      </w:r>
+    </w:p>
+    <w:p>
+      <w:pPr>
         <w:pStyle w:val="Heading3"/>
       </w:pPr>
       <w:r>
@@ -491,6 +591,18 @@
     </w:p>
     <w:p>
       <w:pPr>
+        <w:spacing w:after="160"/>
+      </w:pPr>
+      <w:r>
+        <w:rPr>
+          <w:sz w:val="22"/>
+          <w:szCs w:val="22"/>
+        </w:rPr>
+        <w:t xml:space="preserve">Hausinterne Designer entwerfen bis zu 10 individuelle Konzepte basierend auf dem Briefing.</w:t>
+      </w:r>
+    </w:p>
+    <w:p>
+      <w:pPr>
         <w:pStyle w:val="Heading3"/>
       </w:pPr>
       <w:r>
@@ -499,6 +611,18 @@
     </w:p>
     <w:p>
       <w:pPr>
+        <w:spacing w:after="160"/>
+      </w:pPr>
+      <w:r>
+        <w:rPr>
+          <w:sz w:val="22"/>
+          <w:szCs w:val="22"/>
+        </w:rPr>
+        <w:t xml:space="preserve">Der Kunde prüft und gibt Feedback. Jede Revisionsrunde liefert aktualisierte Konzepte in 3 Werktagen.</w:t>
+      </w:r>
+    </w:p>
+    <w:p>
+      <w:pPr>
         <w:pStyle w:val="Heading3"/>
       </w:pPr>
       <w:r>
@@ -514,66 +638,6 @@
           <w:sz w:val="22"/>
           <w:szCs w:val="22"/>
         </w:rPr>
-        <w:t xml:space="preserve">Fünf klar definierte Schritte. Gesamtzeitplan von zwei bis drei Wochen für die meisten Projekte.</w:t>
-      </w:r>
-    </w:p>
-    <w:p>
-      <w:pPr>
-        <w:spacing w:after="160"/>
-      </w:pPr>
-      <w:r>
-        <w:rPr>
-          <w:sz w:val="22"/>
-          <w:szCs w:val="22"/>
-        </w:rPr>
-        <w:t xml:space="preserve">Der Kunde kauft ein Paket und erhält eine Willkommens-E-Mail.</w:t>
-      </w:r>
-    </w:p>
-    <w:p>
-      <w:pPr>
-        <w:spacing w:after="160"/>
-      </w:pPr>
-      <w:r>
-        <w:rPr>
-          <w:sz w:val="22"/>
-          <w:szCs w:val="22"/>
-        </w:rPr>
-        <w:t xml:space="preserve">Ein dedizierter Koordinator ruft an und mailt, um das Briefing aufzunehmen — Ziele, Stil, Schriften, Farben, Referenzlogos.</w:t>
-      </w:r>
-    </w:p>
-    <w:p>
-      <w:pPr>
-        <w:spacing w:after="160"/>
-      </w:pPr>
-      <w:r>
-        <w:rPr>
-          <w:sz w:val="22"/>
-          <w:szCs w:val="22"/>
-        </w:rPr>
-        <w:t xml:space="preserve">Hausinterne Designer entwerfen bis zu 10 individuelle Konzepte basierend auf dem Briefing.</w:t>
-      </w:r>
-    </w:p>
-    <w:p>
-      <w:pPr>
-        <w:spacing w:after="160"/>
-      </w:pPr>
-      <w:r>
-        <w:rPr>
-          <w:sz w:val="22"/>
-          <w:szCs w:val="22"/>
-        </w:rPr>
-        <w:t xml:space="preserve">Der Kunde prüft und gibt Feedback. Jede Revisionsrunde liefert aktualisierte Konzepte in 3 Werktagen.</w:t>
-      </w:r>
-    </w:p>
-    <w:p>
-      <w:pPr>
-        <w:spacing w:after="160"/>
-      </w:pPr>
-      <w:r>
-        <w:rPr>
-          <w:sz w:val="22"/>
-          <w:szCs w:val="22"/>
-        </w:rPr>
         <w:t xml:space="preserve">Nach Konzeptfreigabe erhält der Kunde alle 11 Dateiformate. Volle Rechteübertragung.</w:t>
       </w:r>
     </w:p>
@@ -592,6 +656,14 @@
     </w:p>
     <w:p>
       <w:pPr>
+        <w:pStyle w:val="Heading2"/>
+      </w:pPr>
+      <w:r>
+        <w:t xml:space="preserve">06 — Pakete &amp; Preise</w:t>
+      </w:r>
+    </w:p>
+    <w:p>
+      <w:pPr>
         <w:pStyle w:val="Heading1"/>
       </w:pPr>
       <w:r>
@@ -637,6 +709,14 @@
     </w:p>
     <w:p>
       <w:pPr>
+        <w:pStyle w:val="Heading2"/>
+      </w:pPr>
+      <w:r>
+        <w:t xml:space="preserve">07 — Verkaufs-Playbook</w:t>
+      </w:r>
+    </w:p>
+    <w:p>
+      <w:pPr>
         <w:pStyle w:val="Heading1"/>
       </w:pPr>
       <w:r>
@@ -656,6 +736,30 @@
       </w:r>
     </w:p>
     <w:p>
+      <w:pPr>
+        <w:pStyle w:val="Heading3"/>
+      </w:pPr>
+      <w:r>
+        <w:t xml:space="preserve">Discovery-Fragen</w:t>
+      </w:r>
+    </w:p>
+    <w:p>
+      <w:pPr>
+        <w:pStyle w:val="Heading3"/>
+      </w:pPr>
+      <w:r>
+        <w:t xml:space="preserve">Branchen mit höchster Passung</w:t>
+      </w:r>
+    </w:p>
+    <w:p>
+      <w:pPr>
+        <w:pStyle w:val="Heading3"/>
+      </w:pPr>
+      <w:r>
+        <w:t xml:space="preserve">Wettbewerbsüberblick</w:t>
+      </w:r>
+    </w:p>
+    <w:p>
       <w:r>
         <w:br w:type="page"/>
       </w:r>
@@ -670,6 +774,14 @@
     </w:p>
     <w:p>
       <w:pPr>
+        <w:pStyle w:val="Heading2"/>
+      </w:pPr>
+      <w:r>
+        <w:t xml:space="preserve">08 — Einwände &amp; FAQs</w:t>
+      </w:r>
+    </w:p>
+    <w:p>
+      <w:pPr>
         <w:pStyle w:val="Heading1"/>
       </w:pPr>
       <w:r>
@@ -678,6 +790,14 @@
     </w:p>
     <w:p>
       <w:pPr>
+        <w:pStyle w:val="Heading3"/>
+      </w:pPr>
+      <w:r>
+        <w:t xml:space="preserve">Umgang mit Einwänden</w:t>
+      </w:r>
+    </w:p>
+    <w:p>
+      <w:pPr>
         <w:spacing w:after="160"/>
       </w:pPr>
       <w:r>
@@ -750,6 +870,14 @@
     </w:p>
     <w:p>
       <w:pPr>
+        <w:pStyle w:val="Heading3"/>
+      </w:pPr>
+      <w:r>
+        <w:t xml:space="preserve">Häufige Fragen</w:t>
+      </w:r>
+    </w:p>
+    <w:p>
+      <w:pPr>
         <w:spacing w:after="160"/>
       </w:pPr>
       <w:r>
@@ -828,6 +956,14 @@
     <w:p>
       <w:pPr>
         <w:pStyle w:val="Heading1"/>
+      </w:pPr>
+      <w:r>
+        <w:t xml:space="preserve">09 — Für Service-Provider</w:t>
+      </w:r>
+    </w:p>
+    <w:p>
+      <w:pPr>
+        <w:pStyle w:val="Heading2"/>
       </w:pPr>
       <w:r>
         <w:t xml:space="preserve">09 — Für Service-Provider</w:t>

</xml_diff>